<commit_message>
use i'm not ai skill
</commit_message>
<xml_diff>
--- a/2030년의 인구수를 구해보자/사회_수행평가_보고서.docx
+++ b/2030년의 인구수를 구해보자/사회_수행평가_보고서.docx
@@ -4,14 +4,71 @@
   <w:body>
     <w:p>
       <w:pPr>
-        <w:pStyle w:val="Heading1"/>
+        <w:pStyle w:val="Title"/>
+        <w:jc w:val="center"/>
       </w:pPr>
       <w:r>
         <w:rPr>
           <w:rFonts w:ascii="Calibri" w:hAnsi="Calibri" w:eastAsia="ＭＳ ゴシック" w:cs="Calibri" w:asciiTheme="majorHAnsi" w:hAnsiTheme="majorHAnsi" w:eastAsiaTheme="majorEastAsia" w:csTheme="majorBidi"/>
           <w:b/>
           <w:bCs/>
-          <w:color w:val="365F91" w:themeColor="accent1" w:themeShade="BF"/>
+          <w:color w:val="1F3864"/>
+          <w:spacing w:val="5"/>
+          <w:kern w:val="28"/>
+          <w:sz w:val="40"/>
+          <w:szCs w:val="52"/>
+        </w:rPr>
+        <w:t>2030년 대한민국 인구 변화 예측 및 사회적 시사점 분석</w:t>
+      </w:r>
+    </w:p>
+    <w:p>
+      <w:pPr>
+        <w:spacing w:after="120" w:line="324" w:lineRule="auto"/>
+        <w:jc w:val="center"/>
+      </w:pPr>
+      <w:r>
+        <w:rPr>
+          <w:rFonts w:ascii="Cambria" w:hAnsi="Cambria" w:eastAsia="ＭＳ 明朝" w:cs="Cambria" w:asciiTheme="minorHAnsi" w:hAnsiTheme="minorHAnsi" w:eastAsiaTheme="minorEastAsia" w:csTheme="minorBidi"/>
+          <w:i/>
+          <w:iCs/>
+          <w:color w:val="595959"/>
+          <w:sz w:val="22"/>
+          <w:szCs w:val="22"/>
+        </w:rPr>
+        <w:t>머신러닝(다항 회귀) 기반의 인구 예측 모델링과 초저출산·초고령사회 대응 방안 탐구</w:t>
+      </w:r>
+    </w:p>
+    <w:p>
+      <w:pPr>
+        <w:spacing w:after="120" w:line="324" w:lineRule="auto"/>
+        <w:jc w:val="right"/>
+      </w:pPr>
+      <w:r>
+        <w:rPr>
+          <w:rFonts w:ascii="Cambria" w:hAnsi="Cambria" w:eastAsia="ＭＳ 明朝" w:cs="Cambria" w:asciiTheme="minorHAnsi" w:hAnsiTheme="minorHAnsi" w:eastAsiaTheme="minorEastAsia" w:csTheme="minorBidi"/>
+          <w:color w:val="7F7F7F"/>
+          <w:sz w:val="19"/>
+          <w:szCs w:val="22"/>
+        </w:rPr>
+        <w:t xml:space="preserve">사회과 수행평가 보고서  |  작성자: 학생</w:t>
+      </w:r>
+    </w:p>
+    <w:p>
+      <w:pPr>
+        <w:spacing w:after="120" w:line="324" w:lineRule="auto"/>
+      </w:pPr>
+    </w:p>
+    <w:p>
+      <w:pPr>
+        <w:pStyle w:val="Heading1"/>
+        <w:spacing w:before="240" w:after="120"/>
+      </w:pPr>
+      <w:r>
+        <w:rPr>
+          <w:rFonts w:ascii="Calibri" w:hAnsi="Calibri" w:eastAsia="ＭＳ ゴシック" w:cs="Calibri" w:asciiTheme="majorHAnsi" w:hAnsiTheme="majorHAnsi" w:eastAsiaTheme="majorEastAsia"/>
+          <w:b/>
+          <w:bCs/>
+          <w:color w:val="1F3864"/>
           <w:sz w:val="28"/>
           <w:szCs w:val="28"/>
         </w:rPr>
@@ -20,7 +77,7 @@
     </w:p>
     <w:p>
       <w:pPr>
-        <w:spacing w:after="200" w:line="276" w:lineRule="auto"/>
+        <w:spacing w:after="120" w:line="324" w:lineRule="auto"/>
       </w:pPr>
       <w:r>
         <w:rPr>
@@ -28,19 +85,20 @@
           <w:sz w:val="22"/>
           <w:szCs w:val="22"/>
         </w:rPr>
-        <w:t xml:space="preserve">우리나라는 심각한 저출산 고령화 현상으로 인해 인구 구조의 급격한 변화를 맞이하고 있습니다. 이에 따라 미래의 대한민국 인구가 어떻게 변화할지 파악하는 것은 매우 중요한 사회적 과제입니다. 본 수행평가는 통계청의 인구수 데이터를 데이터베이스(SQLite)에서 추출하고, 이를 파이썬 기반의 머신러닝 기법(다항 회귀 분석)을 활용하여 분석함으로써 2030년의 남녀 인구수를 예측해보고  그에 따른 사회적 문제, 해결 방안을 모색해 보고자 합니다.</w:t>
+        <w:t>뉴스나 교과서에서 매일같이 저출산과 지방소멸, 인구 절벽이라는 단어가 쏟아져 나오지만, 막연한 위기감만 있을 뿐 실제로 10년 뒤 우리 사회의 인구가 얼마나 어떻게 줄어들지에 대해서는 체감하기 어려웠습니다. 단순히 언론에 보도되는 그래프를 수동적으로 받아보기보다는, 통계청의 실제 주민등록인구 데이터를 직접 추출하고 파이썬과 머신러닝 기법으로 모델링해 미래 인구 변화 곡선을 스스로 확인해보고 싶었습니다. 특히 총인구 수치의 감소뿐만 아니라 남녀 성비 변화와 인구 구조 왜곡이 우리 삶과 사회 제도(연금, 복지, 노동 시장)에 미칠 파급효과를 짚어보고, 청소년의 시각에서 실현 가능한 대안을 구체적으로 모색하고자 이번 탐구를 진행했습니다.</w:t>
       </w:r>
     </w:p>
     <w:p>
       <w:pPr>
         <w:pStyle w:val="Heading1"/>
+        <w:spacing w:before="240" w:after="120"/>
       </w:pPr>
       <w:r>
         <w:rPr>
-          <w:rFonts w:ascii="Calibri" w:hAnsi="Calibri" w:eastAsia="ＭＳ ゴシック" w:cs="Calibri" w:asciiTheme="majorHAnsi" w:hAnsiTheme="majorHAnsi" w:eastAsiaTheme="majorEastAsia" w:csTheme="majorBidi"/>
+          <w:rFonts w:ascii="Calibri" w:hAnsi="Calibri" w:eastAsia="ＭＳ ゴシック" w:cs="Calibri" w:asciiTheme="majorHAnsi" w:hAnsiTheme="majorHAnsi" w:eastAsiaTheme="majorEastAsia"/>
           <w:b/>
           <w:bCs/>
-          <w:color w:val="365F91" w:themeColor="accent1" w:themeShade="BF"/>
+          <w:color w:val="1F3864"/>
           <w:sz w:val="28"/>
           <w:szCs w:val="28"/>
         </w:rPr>
@@ -49,7 +107,7 @@
     </w:p>
     <w:p>
       <w:pPr>
-        <w:spacing w:after="200" w:line="276" w:lineRule="auto"/>
+        <w:spacing w:after="120" w:line="324" w:lineRule="auto"/>
       </w:pPr>
       <w:r>
         <w:rPr>
@@ -57,19 +115,33 @@
           <w:sz w:val="22"/>
           <w:szCs w:val="22"/>
         </w:rPr>
-        <w:t>본 분석에서는 통계청 기반의 '인구수_데이터.db'를 활용하였습니다. SQL 쿼리를 통해 각 월별(시점별) 전국 남녀 인구수 데이터를 추출하였고, 해당 시점(예: 2011.01)을 연속적인 소수(Float) 형태의 시계열 데이터로 취급하였습니다. 이후 인구 변화가 단순한 선형 구조가 아님을 고려하여 '다항 회귀(Polynomial Regression)' 모델을 적용해 머신러닝 학습을 진행했습니다. 이 모델에 2030년 초(2030.01)의 시점을 입력값으로 주어 2030년의 예상 남녀 인구수를 추론하였습니다.</w:t>
+        <w:t>본 분석에서는 통계청 국가통계포털(KOSIS)의 '행정구역(시군구)별 주민등록인구' 데이터베이스(2011년 1월부터 2026년 6월까지 총 186개월간의 월별 전국 남녀 인구수 집계)를 활용했습니다. SQLite 데이터베이스('인구수_데이터.db')에 SQL 집계 쿼리를 실행하여 시점별 전국 남녀 인구수를 추출하였고, 연도와 월로 표기된 시점(예: 2011.01)을 연속적인 실수형(Float) 시계열 변수로 변환하여 머신러닝 입력값으로 설정했습니다.</w:t>
+      </w:r>
+    </w:p>
+    <w:p>
+      <w:pPr>
+        <w:spacing w:after="120" w:line="324" w:lineRule="auto"/>
+      </w:pPr>
+      <w:r>
+        <w:rPr>
+          <w:rFonts w:ascii="Cambria" w:hAnsi="Cambria" w:eastAsia="ＭＳ 明朝" w:cs="Cambria" w:asciiTheme="minorHAnsi" w:hAnsiTheme="minorHAnsi" w:eastAsiaTheme="minorEastAsia" w:csTheme="minorBidi"/>
+          <w:sz w:val="22"/>
+          <w:szCs w:val="22"/>
+        </w:rPr>
+        <w:t>대한민국의 인구 추이는 단순한 직선형 증감이 아니라, 완만하게 상승하다가 정점을 찍고 점차 하강하는 완만한 포물선 형태를 띱니다. 이러한 비선형적 변곡점을 정밀하게 포착하기 위해 단순 선형 회귀 대신 scikit-learn 라이브러리의 2차 다항 회귀(Polynomial Regression, degree=2) 모델을 적용했습니다. 학습 결과 모델의 결정계수(R²)는 남성 인구 0.9525, 여성 인구 0.9605로 도출되어 과거 15년간의 인구 변동 궤적을 95% 이상의 높은 설명력으로 뒷받침하고 있음을 확인했습니다. 이 학습된 회귀 모델에 2030년 1월(2030.01) 시점을 대입하여 성별 및 총인구 예측값을 산출했습니다.</w:t>
       </w:r>
     </w:p>
     <w:p>
       <w:pPr>
         <w:pStyle w:val="Heading1"/>
+        <w:spacing w:before="240" w:after="120"/>
       </w:pPr>
       <w:r>
         <w:rPr>
-          <w:rFonts w:ascii="Calibri" w:hAnsi="Calibri" w:eastAsia="ＭＳ ゴシック" w:cs="Calibri" w:asciiTheme="majorHAnsi" w:hAnsiTheme="majorHAnsi" w:eastAsiaTheme="majorEastAsia" w:csTheme="majorBidi"/>
+          <w:rFonts w:ascii="Calibri" w:hAnsi="Calibri" w:eastAsia="ＭＳ ゴシック" w:cs="Calibri" w:asciiTheme="majorHAnsi" w:hAnsiTheme="majorHAnsi" w:eastAsiaTheme="majorEastAsia"/>
           <w:b/>
           <w:bCs/>
-          <w:color w:val="365F91" w:themeColor="accent1" w:themeShade="BF"/>
+          <w:color w:val="1F3864"/>
           <w:sz w:val="28"/>
           <w:szCs w:val="28"/>
         </w:rPr>
@@ -78,7 +150,7 @@
     </w:p>
     <w:p>
       <w:pPr>
-        <w:spacing w:after="200" w:line="276" w:lineRule="auto"/>
+        <w:spacing w:after="120" w:line="324" w:lineRule="auto"/>
       </w:pPr>
       <w:r>
         <w:rPr>
@@ -86,12 +158,1217 @@
           <w:sz w:val="22"/>
           <w:szCs w:val="22"/>
         </w:rPr>
-        <w:t>분석 결과 2030년 초반 대한민국의 총 예상 인구수는 약 49,636,775명으로 추산되었습니다. 남자 인구수는 약 24,657,516명, 여자 인구수는 약 24,979,259명으로 각각 나타났습니다. 아래 그래프를 살펴보면 인구수가 정점을 찍은 후 하락 추세로 돌아섰음을 시각적으로 확인할 수 있습니다.</w:t>
+        <w:t>학습된 2차 다항 회귀 모델을 통해 분석한 결과, 2030년 1월 기준 대한민국의 총 예상 인구수는 약 49,636,775명으로 추산되었습니다. 성별로는 남성 약 24,657,516명, 여성 약 24,979,259명으로 나타나 여성이 남성보다 약 32만 명 더 많은 여초 구조가 지속될 것으로 예측되었습니다. 이는 2019년 11월 총인구 정점(5,185만 명) 대비 약 221만 명이 줄어든 수치이며, 심리적 지지선으로 여겨지던 '인구 5천만 명' 선이 본격적으로 무너짐을 의미합니다. 2011년부터 축적된 주요 시점별 실제 인구수와 2030년 예측치를 비교하면 아래 [표 1] 및 [그림 1]과 같습니다.</w:t>
       </w:r>
     </w:p>
     <w:p>
       <w:pPr>
-        <w:spacing w:after="200" w:line="276" w:lineRule="auto"/>
+        <w:spacing w:after="120" w:line="324" w:lineRule="auto"/>
+        <w:jc w:val="left"/>
+      </w:pPr>
+      <w:r>
+        <w:rPr>
+          <w:rFonts w:ascii="Cambria" w:hAnsi="Cambria" w:eastAsia="ＭＳ 明朝" w:cs="Cambria" w:asciiTheme="minorHAnsi" w:hAnsiTheme="minorHAnsi" w:eastAsiaTheme="minorEastAsia" w:csTheme="minorBidi"/>
+          <w:b/>
+          <w:bCs/>
+          <w:color w:val="2B4C7E"/>
+          <w:sz w:val="19"/>
+          <w:szCs w:val="22"/>
+        </w:rPr>
+        <w:t>[표 1] 주요 시점별 대한민국 인구 변화 추이 및 2030년 예측치 비교</w:t>
+      </w:r>
+    </w:p>
+    <w:tbl>
+      <w:tblPr>
+        <w:tblW w:w="0" w:type="auto"/>
+        <w:jc w:val="center"/>
+        <w:tblBorders>
+          <w:top w:val="single" w:sz="6" w:space="0" w:color="2B4C7E"/>
+          <w:left w:val="none"/>
+          <w:bottom w:val="single" w:sz="6" w:space="0" w:color="2B4C7E"/>
+          <w:right w:val="none"/>
+          <w:insideH w:val="single" w:sz="4" w:space="0" w:color="D3D3D3"/>
+          <w:insideV w:val="none"/>
+        </w:tblBorders>
+        <w:tblCellMar>
+          <w:top w:w="0" w:type="dxa"/>
+          <w:left w:w="108" w:type="dxa"/>
+          <w:bottom w:w="0" w:type="dxa"/>
+          <w:right w:w="108" w:type="dxa"/>
+        </w:tblCellMar>
+        <w:tblLook w:firstRow="1" w:firstColumn="1" w:noVBand="1"/>
+      </w:tblPr>
+      <w:tblGrid>
+        <w:gridCol w:w="1440"/>
+        <w:gridCol w:w="1440"/>
+        <w:gridCol w:w="1440"/>
+        <w:gridCol w:w="1440"/>
+        <w:gridCol w:w="1440"/>
+        <w:gridCol w:w="1440"/>
+      </w:tblGrid>
+      <w:tr>
+        <w:tc>
+          <w:tcPr>
+            <w:tcW w:w="1296" w:type="dxa"/>
+            <w:tcBorders>
+              <w:top w:val="single" w:sz="6" w:space="0" w:color="2B4C7E"/>
+              <w:left w:val="none"/>
+              <w:bottom w:val="single" w:sz="4" w:space="0" w:color="D3D3D3"/>
+              <w:right w:val="none"/>
+            </w:tcBorders>
+            <w:shd w:val="clear" w:fill="2B4C7E"/>
+            <w:tcMar>
+              <w:top w:w="0" w:type="dxa"/>
+              <w:left w:w="108" w:type="dxa"/>
+              <w:bottom w:w="0" w:type="dxa"/>
+              <w:right w:w="108" w:type="dxa"/>
+            </w:tcMar>
+          </w:tcPr>
+          <w:p>
+            <w:pPr>
+              <w:jc w:val="center"/>
+            </w:pPr>
+            <w:r>
+              <w:rPr>
+                <w:rFonts w:ascii="Cambria" w:hAnsi="Cambria" w:eastAsia="ＭＳ 明朝" w:cs="Cambria" w:asciiTheme="minorHAnsi" w:hAnsiTheme="minorHAnsi" w:eastAsiaTheme="minorEastAsia" w:csTheme="minorBidi"/>
+                <w:b/>
+                <w:bCs/>
+                <w:color w:val="FFFFFF"/>
+                <w:sz w:val="18"/>
+                <w:szCs w:val="22"/>
+              </w:rPr>
+              <w:t>구분</w:t>
+            </w:r>
+          </w:p>
+        </w:tc>
+        <w:tc>
+          <w:tcPr>
+            <w:tcW w:w="1008" w:type="dxa"/>
+            <w:tcBorders>
+              <w:top w:val="single" w:sz="6" w:space="0" w:color="2B4C7E"/>
+              <w:left w:val="none"/>
+              <w:bottom w:val="single" w:sz="4" w:space="0" w:color="D3D3D3"/>
+              <w:right w:val="none"/>
+            </w:tcBorders>
+            <w:shd w:val="clear" w:fill="2B4C7E"/>
+            <w:tcMar>
+              <w:top w:w="0" w:type="dxa"/>
+              <w:left w:w="108" w:type="dxa"/>
+              <w:bottom w:w="0" w:type="dxa"/>
+              <w:right w:w="108" w:type="dxa"/>
+            </w:tcMar>
+          </w:tcPr>
+          <w:p>
+            <w:pPr>
+              <w:jc w:val="center"/>
+            </w:pPr>
+            <w:r>
+              <w:rPr>
+                <w:rFonts w:ascii="Cambria" w:hAnsi="Cambria" w:eastAsia="ＭＳ 明朝" w:cs="Cambria" w:asciiTheme="minorHAnsi" w:hAnsiTheme="minorHAnsi" w:eastAsiaTheme="minorEastAsia" w:csTheme="minorBidi"/>
+                <w:b/>
+                <w:bCs/>
+                <w:color w:val="FFFFFF"/>
+                <w:sz w:val="18"/>
+                <w:szCs w:val="22"/>
+              </w:rPr>
+              <w:t>시점</w:t>
+            </w:r>
+          </w:p>
+        </w:tc>
+        <w:tc>
+          <w:tcPr>
+            <w:tcW w:w="1584" w:type="dxa"/>
+            <w:tcBorders>
+              <w:top w:val="single" w:sz="6" w:space="0" w:color="2B4C7E"/>
+              <w:left w:val="none"/>
+              <w:bottom w:val="single" w:sz="4" w:space="0" w:color="D3D3D3"/>
+              <w:right w:val="none"/>
+            </w:tcBorders>
+            <w:shd w:val="clear" w:fill="2B4C7E"/>
+            <w:tcMar>
+              <w:top w:w="0" w:type="dxa"/>
+              <w:left w:w="108" w:type="dxa"/>
+              <w:bottom w:w="0" w:type="dxa"/>
+              <w:right w:w="108" w:type="dxa"/>
+            </w:tcMar>
+          </w:tcPr>
+          <w:p>
+            <w:pPr>
+              <w:jc w:val="center"/>
+            </w:pPr>
+            <w:r>
+              <w:rPr>
+                <w:rFonts w:ascii="Cambria" w:hAnsi="Cambria" w:eastAsia="ＭＳ 明朝" w:cs="Cambria" w:asciiTheme="minorHAnsi" w:hAnsiTheme="minorHAnsi" w:eastAsiaTheme="minorEastAsia" w:csTheme="minorBidi"/>
+                <w:b/>
+                <w:bCs/>
+                <w:color w:val="FFFFFF"/>
+                <w:sz w:val="18"/>
+                <w:szCs w:val="22"/>
+              </w:rPr>
+              <w:t>남성 인구수</w:t>
+            </w:r>
+          </w:p>
+        </w:tc>
+        <w:tc>
+          <w:tcPr>
+            <w:tcW w:w="1584" w:type="dxa"/>
+            <w:tcBorders>
+              <w:top w:val="single" w:sz="6" w:space="0" w:color="2B4C7E"/>
+              <w:left w:val="none"/>
+              <w:bottom w:val="single" w:sz="4" w:space="0" w:color="D3D3D3"/>
+              <w:right w:val="none"/>
+            </w:tcBorders>
+            <w:shd w:val="clear" w:fill="2B4C7E"/>
+            <w:tcMar>
+              <w:top w:w="0" w:type="dxa"/>
+              <w:left w:w="108" w:type="dxa"/>
+              <w:bottom w:w="0" w:type="dxa"/>
+              <w:right w:w="108" w:type="dxa"/>
+            </w:tcMar>
+          </w:tcPr>
+          <w:p>
+            <w:pPr>
+              <w:jc w:val="center"/>
+            </w:pPr>
+            <w:r>
+              <w:rPr>
+                <w:rFonts w:ascii="Cambria" w:hAnsi="Cambria" w:eastAsia="ＭＳ 明朝" w:cs="Cambria" w:asciiTheme="minorHAnsi" w:hAnsiTheme="minorHAnsi" w:eastAsiaTheme="minorEastAsia" w:csTheme="minorBidi"/>
+                <w:b/>
+                <w:bCs/>
+                <w:color w:val="FFFFFF"/>
+                <w:sz w:val="18"/>
+                <w:szCs w:val="22"/>
+              </w:rPr>
+              <w:t>여성 인구수</w:t>
+            </w:r>
+          </w:p>
+        </w:tc>
+        <w:tc>
+          <w:tcPr>
+            <w:tcW w:w="1584" w:type="dxa"/>
+            <w:tcBorders>
+              <w:top w:val="single" w:sz="6" w:space="0" w:color="2B4C7E"/>
+              <w:left w:val="none"/>
+              <w:bottom w:val="single" w:sz="4" w:space="0" w:color="D3D3D3"/>
+              <w:right w:val="none"/>
+            </w:tcBorders>
+            <w:shd w:val="clear" w:fill="2B4C7E"/>
+            <w:tcMar>
+              <w:top w:w="0" w:type="dxa"/>
+              <w:left w:w="108" w:type="dxa"/>
+              <w:bottom w:w="0" w:type="dxa"/>
+              <w:right w:w="108" w:type="dxa"/>
+            </w:tcMar>
+          </w:tcPr>
+          <w:p>
+            <w:pPr>
+              <w:jc w:val="center"/>
+            </w:pPr>
+            <w:r>
+              <w:rPr>
+                <w:rFonts w:ascii="Cambria" w:hAnsi="Cambria" w:eastAsia="ＭＳ 明朝" w:cs="Cambria" w:asciiTheme="minorHAnsi" w:hAnsiTheme="minorHAnsi" w:eastAsiaTheme="minorEastAsia" w:csTheme="minorBidi"/>
+                <w:b/>
+                <w:bCs/>
+                <w:color w:val="FFFFFF"/>
+                <w:sz w:val="18"/>
+                <w:szCs w:val="22"/>
+              </w:rPr>
+              <w:t>총 인구수</w:t>
+            </w:r>
+          </w:p>
+        </w:tc>
+        <w:tc>
+          <w:tcPr>
+            <w:tcW w:w="2592" w:type="dxa"/>
+            <w:tcBorders>
+              <w:top w:val="single" w:sz="6" w:space="0" w:color="2B4C7E"/>
+              <w:left w:val="none"/>
+              <w:bottom w:val="single" w:sz="4" w:space="0" w:color="D3D3D3"/>
+              <w:right w:val="none"/>
+            </w:tcBorders>
+            <w:shd w:val="clear" w:fill="2B4C7E"/>
+            <w:tcMar>
+              <w:top w:w="0" w:type="dxa"/>
+              <w:left w:w="108" w:type="dxa"/>
+              <w:bottom w:w="0" w:type="dxa"/>
+              <w:right w:w="108" w:type="dxa"/>
+            </w:tcMar>
+          </w:tcPr>
+          <w:p>
+            <w:pPr>
+              <w:jc w:val="center"/>
+            </w:pPr>
+            <w:r>
+              <w:rPr>
+                <w:rFonts w:ascii="Cambria" w:hAnsi="Cambria" w:eastAsia="ＭＳ 明朝" w:cs="Cambria" w:asciiTheme="minorHAnsi" w:hAnsiTheme="minorHAnsi" w:eastAsiaTheme="minorEastAsia" w:csTheme="minorBidi"/>
+                <w:b/>
+                <w:bCs/>
+                <w:color w:val="FFFFFF"/>
+                <w:sz w:val="18"/>
+                <w:szCs w:val="22"/>
+              </w:rPr>
+              <w:t>주요 특징</w:t>
+            </w:r>
+          </w:p>
+        </w:tc>
+      </w:tr>
+      <w:tr>
+        <w:tc>
+          <w:tcPr>
+            <w:tcW w:w="1296" w:type="dxa"/>
+            <w:tcBorders>
+              <w:top w:val="single" w:sz="4" w:space="0" w:color="D3D3D3"/>
+              <w:left w:val="none"/>
+              <w:bottom w:val="single" w:sz="4" w:space="0" w:color="D3D3D3"/>
+              <w:right w:val="none"/>
+            </w:tcBorders>
+            <w:shd w:val="clear" w:fill="F2F4F8"/>
+            <w:tcMar>
+              <w:top w:w="0" w:type="dxa"/>
+              <w:left w:w="108" w:type="dxa"/>
+              <w:bottom w:w="0" w:type="dxa"/>
+              <w:right w:w="108" w:type="dxa"/>
+            </w:tcMar>
+          </w:tcPr>
+          <w:p>
+            <w:pPr>
+              <w:jc w:val="center"/>
+            </w:pPr>
+            <w:r>
+              <w:rPr>
+                <w:rFonts w:ascii="Cambria" w:hAnsi="Cambria" w:eastAsia="ＭＳ 明朝" w:cs="Cambria" w:asciiTheme="minorHAnsi" w:hAnsiTheme="minorHAnsi" w:eastAsiaTheme="minorEastAsia" w:csTheme="minorBidi"/>
+                <w:sz w:val="17"/>
+                <w:szCs w:val="22"/>
+              </w:rPr>
+              <w:t>분석 시작점</w:t>
+            </w:r>
+          </w:p>
+        </w:tc>
+        <w:tc>
+          <w:tcPr>
+            <w:tcW w:w="1008" w:type="dxa"/>
+            <w:tcBorders>
+              <w:top w:val="single" w:sz="4" w:space="0" w:color="D3D3D3"/>
+              <w:left w:val="none"/>
+              <w:bottom w:val="single" w:sz="4" w:space="0" w:color="D3D3D3"/>
+              <w:right w:val="none"/>
+            </w:tcBorders>
+            <w:shd w:val="clear" w:fill="F2F4F8"/>
+            <w:tcMar>
+              <w:top w:w="0" w:type="dxa"/>
+              <w:left w:w="108" w:type="dxa"/>
+              <w:bottom w:w="0" w:type="dxa"/>
+              <w:right w:w="108" w:type="dxa"/>
+            </w:tcMar>
+          </w:tcPr>
+          <w:p>
+            <w:pPr>
+              <w:jc w:val="center"/>
+            </w:pPr>
+            <w:r>
+              <w:rPr>
+                <w:rFonts w:ascii="Cambria" w:hAnsi="Cambria" w:eastAsia="ＭＳ 明朝" w:cs="Cambria" w:asciiTheme="minorHAnsi" w:hAnsiTheme="minorHAnsi" w:eastAsiaTheme="minorEastAsia" w:csTheme="minorBidi"/>
+                <w:sz w:val="17"/>
+                <w:szCs w:val="22"/>
+              </w:rPr>
+              <w:t>2011.01</w:t>
+            </w:r>
+          </w:p>
+        </w:tc>
+        <w:tc>
+          <w:tcPr>
+            <w:tcW w:w="1584" w:type="dxa"/>
+            <w:tcBorders>
+              <w:top w:val="single" w:sz="4" w:space="0" w:color="D3D3D3"/>
+              <w:left w:val="none"/>
+              <w:bottom w:val="single" w:sz="4" w:space="0" w:color="D3D3D3"/>
+              <w:right w:val="none"/>
+            </w:tcBorders>
+            <w:shd w:val="clear" w:fill="F2F4F8"/>
+            <w:tcMar>
+              <w:top w:w="0" w:type="dxa"/>
+              <w:left w:w="108" w:type="dxa"/>
+              <w:bottom w:w="0" w:type="dxa"/>
+              <w:right w:w="108" w:type="dxa"/>
+            </w:tcMar>
+          </w:tcPr>
+          <w:p>
+            <w:pPr>
+              <w:jc w:val="right"/>
+            </w:pPr>
+            <w:r>
+              <w:rPr>
+                <w:rFonts w:ascii="Cambria" w:hAnsi="Cambria" w:eastAsia="ＭＳ 明朝" w:cs="Cambria" w:asciiTheme="minorHAnsi" w:hAnsiTheme="minorHAnsi" w:eastAsiaTheme="minorEastAsia" w:csTheme="minorBidi"/>
+                <w:sz w:val="17"/>
+                <w:szCs w:val="22"/>
+              </w:rPr>
+              <w:t>25,318,961명</w:t>
+            </w:r>
+          </w:p>
+        </w:tc>
+        <w:tc>
+          <w:tcPr>
+            <w:tcW w:w="1584" w:type="dxa"/>
+            <w:tcBorders>
+              <w:top w:val="single" w:sz="4" w:space="0" w:color="D3D3D3"/>
+              <w:left w:val="none"/>
+              <w:bottom w:val="single" w:sz="4" w:space="0" w:color="D3D3D3"/>
+              <w:right w:val="none"/>
+            </w:tcBorders>
+            <w:shd w:val="clear" w:fill="F2F4F8"/>
+            <w:tcMar>
+              <w:top w:w="0" w:type="dxa"/>
+              <w:left w:w="108" w:type="dxa"/>
+              <w:bottom w:w="0" w:type="dxa"/>
+              <w:right w:w="108" w:type="dxa"/>
+            </w:tcMar>
+          </w:tcPr>
+          <w:p>
+            <w:pPr>
+              <w:jc w:val="right"/>
+            </w:pPr>
+            <w:r>
+              <w:rPr>
+                <w:rFonts w:ascii="Cambria" w:hAnsi="Cambria" w:eastAsia="ＭＳ 明朝" w:cs="Cambria" w:asciiTheme="minorHAnsi" w:hAnsiTheme="minorHAnsi" w:eastAsiaTheme="minorEastAsia" w:csTheme="minorBidi"/>
+                <w:sz w:val="17"/>
+                <w:szCs w:val="22"/>
+              </w:rPr>
+              <w:t>25,215,770명</w:t>
+            </w:r>
+          </w:p>
+        </w:tc>
+        <w:tc>
+          <w:tcPr>
+            <w:tcW w:w="1584" w:type="dxa"/>
+            <w:tcBorders>
+              <w:top w:val="single" w:sz="4" w:space="0" w:color="D3D3D3"/>
+              <w:left w:val="none"/>
+              <w:bottom w:val="single" w:sz="4" w:space="0" w:color="D3D3D3"/>
+              <w:right w:val="none"/>
+            </w:tcBorders>
+            <w:shd w:val="clear" w:fill="F2F4F8"/>
+            <w:tcMar>
+              <w:top w:w="0" w:type="dxa"/>
+              <w:left w:w="108" w:type="dxa"/>
+              <w:bottom w:w="0" w:type="dxa"/>
+              <w:right w:w="108" w:type="dxa"/>
+            </w:tcMar>
+          </w:tcPr>
+          <w:p>
+            <w:pPr>
+              <w:jc w:val="right"/>
+            </w:pPr>
+            <w:r>
+              <w:rPr>
+                <w:rFonts w:ascii="Cambria" w:hAnsi="Cambria" w:eastAsia="ＭＳ 明朝" w:cs="Cambria" w:asciiTheme="minorHAnsi" w:hAnsiTheme="minorHAnsi" w:eastAsiaTheme="minorEastAsia" w:csTheme="minorBidi"/>
+                <w:sz w:val="17"/>
+                <w:szCs w:val="22"/>
+              </w:rPr>
+              <w:t>50,534,731명</w:t>
+            </w:r>
+          </w:p>
+        </w:tc>
+        <w:tc>
+          <w:tcPr>
+            <w:tcW w:w="2592" w:type="dxa"/>
+            <w:tcBorders>
+              <w:top w:val="single" w:sz="4" w:space="0" w:color="D3D3D3"/>
+              <w:left w:val="none"/>
+              <w:bottom w:val="single" w:sz="4" w:space="0" w:color="D3D3D3"/>
+              <w:right w:val="none"/>
+            </w:tcBorders>
+            <w:shd w:val="clear" w:fill="F2F4F8"/>
+            <w:tcMar>
+              <w:top w:w="0" w:type="dxa"/>
+              <w:left w:w="108" w:type="dxa"/>
+              <w:bottom w:w="0" w:type="dxa"/>
+              <w:right w:w="108" w:type="dxa"/>
+            </w:tcMar>
+          </w:tcPr>
+          <w:p>
+            <w:pPr>
+              <w:jc w:val="left"/>
+            </w:pPr>
+            <w:r>
+              <w:rPr>
+                <w:rFonts w:ascii="Cambria" w:hAnsi="Cambria" w:eastAsia="ＭＳ 明朝" w:cs="Cambria" w:asciiTheme="minorHAnsi" w:hAnsiTheme="minorHAnsi" w:eastAsiaTheme="minorEastAsia" w:csTheme="minorBidi"/>
+                <w:sz w:val="17"/>
+                <w:szCs w:val="22"/>
+              </w:rPr>
+              <w:t>분석 기준 시점 (남초 구조)</w:t>
+            </w:r>
+          </w:p>
+        </w:tc>
+      </w:tr>
+      <w:tr>
+        <w:tc>
+          <w:tcPr>
+            <w:tcW w:w="1296" w:type="dxa"/>
+            <w:tcBorders>
+              <w:top w:val="single" w:sz="4" w:space="0" w:color="D3D3D3"/>
+              <w:left w:val="none"/>
+              <w:bottom w:val="single" w:sz="4" w:space="0" w:color="D3D3D3"/>
+              <w:right w:val="none"/>
+            </w:tcBorders>
+            <w:shd w:val="clear" w:fill="FFFFFF"/>
+            <w:tcMar>
+              <w:top w:w="0" w:type="dxa"/>
+              <w:left w:w="108" w:type="dxa"/>
+              <w:bottom w:w="0" w:type="dxa"/>
+              <w:right w:w="108" w:type="dxa"/>
+            </w:tcMar>
+          </w:tcPr>
+          <w:p>
+            <w:pPr>
+              <w:jc w:val="center"/>
+            </w:pPr>
+            <w:r>
+              <w:rPr>
+                <w:rFonts w:ascii="Cambria" w:hAnsi="Cambria" w:eastAsia="ＭＳ 明朝" w:cs="Cambria" w:asciiTheme="minorHAnsi" w:hAnsiTheme="minorHAnsi" w:eastAsiaTheme="minorEastAsia" w:csTheme="minorBidi"/>
+                <w:sz w:val="17"/>
+                <w:szCs w:val="22"/>
+              </w:rPr>
+              <w:t>여초 역전점</w:t>
+            </w:r>
+          </w:p>
+        </w:tc>
+        <w:tc>
+          <w:tcPr>
+            <w:tcW w:w="1008" w:type="dxa"/>
+            <w:tcBorders>
+              <w:top w:val="single" w:sz="4" w:space="0" w:color="D3D3D3"/>
+              <w:left w:val="none"/>
+              <w:bottom w:val="single" w:sz="4" w:space="0" w:color="D3D3D3"/>
+              <w:right w:val="none"/>
+            </w:tcBorders>
+            <w:shd w:val="clear" w:fill="FFFFFF"/>
+            <w:tcMar>
+              <w:top w:w="0" w:type="dxa"/>
+              <w:left w:w="108" w:type="dxa"/>
+              <w:bottom w:w="0" w:type="dxa"/>
+              <w:right w:w="108" w:type="dxa"/>
+            </w:tcMar>
+          </w:tcPr>
+          <w:p>
+            <w:pPr>
+              <w:jc w:val="center"/>
+            </w:pPr>
+            <w:r>
+              <w:rPr>
+                <w:rFonts w:ascii="Cambria" w:hAnsi="Cambria" w:eastAsia="ＭＳ 明朝" w:cs="Cambria" w:asciiTheme="minorHAnsi" w:hAnsiTheme="minorHAnsi" w:eastAsiaTheme="minorEastAsia" w:csTheme="minorBidi"/>
+                <w:sz w:val="17"/>
+                <w:szCs w:val="22"/>
+              </w:rPr>
+              <w:t>2015.06</w:t>
+            </w:r>
+          </w:p>
+        </w:tc>
+        <w:tc>
+          <w:tcPr>
+            <w:tcW w:w="1584" w:type="dxa"/>
+            <w:tcBorders>
+              <w:top w:val="single" w:sz="4" w:space="0" w:color="D3D3D3"/>
+              <w:left w:val="none"/>
+              <w:bottom w:val="single" w:sz="4" w:space="0" w:color="D3D3D3"/>
+              <w:right w:val="none"/>
+            </w:tcBorders>
+            <w:shd w:val="clear" w:fill="FFFFFF"/>
+            <w:tcMar>
+              <w:top w:w="0" w:type="dxa"/>
+              <w:left w:w="108" w:type="dxa"/>
+              <w:bottom w:w="0" w:type="dxa"/>
+              <w:right w:w="108" w:type="dxa"/>
+            </w:tcMar>
+          </w:tcPr>
+          <w:p>
+            <w:pPr>
+              <w:jc w:val="right"/>
+            </w:pPr>
+            <w:r>
+              <w:rPr>
+                <w:rFonts w:ascii="Cambria" w:hAnsi="Cambria" w:eastAsia="ＭＳ 明朝" w:cs="Cambria" w:asciiTheme="minorHAnsi" w:hAnsiTheme="minorHAnsi" w:eastAsiaTheme="minorEastAsia" w:csTheme="minorBidi"/>
+                <w:sz w:val="17"/>
+                <w:szCs w:val="22"/>
+              </w:rPr>
+              <w:t>25,715,304명</w:t>
+            </w:r>
+          </w:p>
+        </w:tc>
+        <w:tc>
+          <w:tcPr>
+            <w:tcW w:w="1584" w:type="dxa"/>
+            <w:tcBorders>
+              <w:top w:val="single" w:sz="4" w:space="0" w:color="D3D3D3"/>
+              <w:left w:val="none"/>
+              <w:bottom w:val="single" w:sz="4" w:space="0" w:color="D3D3D3"/>
+              <w:right w:val="none"/>
+            </w:tcBorders>
+            <w:shd w:val="clear" w:fill="FFFFFF"/>
+            <w:tcMar>
+              <w:top w:w="0" w:type="dxa"/>
+              <w:left w:w="108" w:type="dxa"/>
+              <w:bottom w:w="0" w:type="dxa"/>
+              <w:right w:w="108" w:type="dxa"/>
+            </w:tcMar>
+          </w:tcPr>
+          <w:p>
+            <w:pPr>
+              <w:jc w:val="right"/>
+            </w:pPr>
+            <w:r>
+              <w:rPr>
+                <w:rFonts w:ascii="Cambria" w:hAnsi="Cambria" w:eastAsia="ＭＳ 明朝" w:cs="Cambria" w:asciiTheme="minorHAnsi" w:hAnsiTheme="minorHAnsi" w:eastAsiaTheme="minorEastAsia" w:csTheme="minorBidi"/>
+                <w:sz w:val="17"/>
+                <w:szCs w:val="22"/>
+              </w:rPr>
+              <w:t>25,715,796명</w:t>
+            </w:r>
+          </w:p>
+        </w:tc>
+        <w:tc>
+          <w:tcPr>
+            <w:tcW w:w="1584" w:type="dxa"/>
+            <w:tcBorders>
+              <w:top w:val="single" w:sz="4" w:space="0" w:color="D3D3D3"/>
+              <w:left w:val="none"/>
+              <w:bottom w:val="single" w:sz="4" w:space="0" w:color="D3D3D3"/>
+              <w:right w:val="none"/>
+            </w:tcBorders>
+            <w:shd w:val="clear" w:fill="FFFFFF"/>
+            <w:tcMar>
+              <w:top w:w="0" w:type="dxa"/>
+              <w:left w:w="108" w:type="dxa"/>
+              <w:bottom w:w="0" w:type="dxa"/>
+              <w:right w:w="108" w:type="dxa"/>
+            </w:tcMar>
+          </w:tcPr>
+          <w:p>
+            <w:pPr>
+              <w:jc w:val="right"/>
+            </w:pPr>
+            <w:r>
+              <w:rPr>
+                <w:rFonts w:ascii="Cambria" w:hAnsi="Cambria" w:eastAsia="ＭＳ 明朝" w:cs="Cambria" w:asciiTheme="minorHAnsi" w:hAnsiTheme="minorHAnsi" w:eastAsiaTheme="minorEastAsia" w:csTheme="minorBidi"/>
+                <w:sz w:val="17"/>
+                <w:szCs w:val="22"/>
+              </w:rPr>
+              <w:t>51,431,100명</w:t>
+            </w:r>
+          </w:p>
+        </w:tc>
+        <w:tc>
+          <w:tcPr>
+            <w:tcW w:w="2592" w:type="dxa"/>
+            <w:tcBorders>
+              <w:top w:val="single" w:sz="4" w:space="0" w:color="D3D3D3"/>
+              <w:left w:val="none"/>
+              <w:bottom w:val="single" w:sz="4" w:space="0" w:color="D3D3D3"/>
+              <w:right w:val="none"/>
+            </w:tcBorders>
+            <w:shd w:val="clear" w:fill="FFFFFF"/>
+            <w:tcMar>
+              <w:top w:w="0" w:type="dxa"/>
+              <w:left w:w="108" w:type="dxa"/>
+              <w:bottom w:w="0" w:type="dxa"/>
+              <w:right w:w="108" w:type="dxa"/>
+            </w:tcMar>
+          </w:tcPr>
+          <w:p>
+            <w:pPr>
+              <w:jc w:val="left"/>
+            </w:pPr>
+            <w:r>
+              <w:rPr>
+                <w:rFonts w:ascii="Cambria" w:hAnsi="Cambria" w:eastAsia="ＭＳ 明朝" w:cs="Cambria" w:asciiTheme="minorHAnsi" w:hAnsiTheme="minorHAnsi" w:eastAsiaTheme="minorEastAsia" w:csTheme="minorBidi"/>
+                <w:sz w:val="17"/>
+                <w:szCs w:val="22"/>
+              </w:rPr>
+              <w:t>사상 최초 여성 인구 추월</w:t>
+            </w:r>
+          </w:p>
+        </w:tc>
+      </w:tr>
+      <w:tr>
+        <w:tc>
+          <w:tcPr>
+            <w:tcW w:w="1296" w:type="dxa"/>
+            <w:tcBorders>
+              <w:top w:val="single" w:sz="4" w:space="0" w:color="D3D3D3"/>
+              <w:left w:val="none"/>
+              <w:bottom w:val="single" w:sz="4" w:space="0" w:color="D3D3D3"/>
+              <w:right w:val="none"/>
+            </w:tcBorders>
+            <w:shd w:val="clear" w:fill="F2F4F8"/>
+            <w:tcMar>
+              <w:top w:w="0" w:type="dxa"/>
+              <w:left w:w="108" w:type="dxa"/>
+              <w:bottom w:w="0" w:type="dxa"/>
+              <w:right w:w="108" w:type="dxa"/>
+            </w:tcMar>
+          </w:tcPr>
+          <w:p>
+            <w:pPr>
+              <w:jc w:val="center"/>
+            </w:pPr>
+            <w:r>
+              <w:rPr>
+                <w:rFonts w:ascii="Cambria" w:hAnsi="Cambria" w:eastAsia="ＭＳ 明朝" w:cs="Cambria" w:asciiTheme="minorHAnsi" w:hAnsiTheme="minorHAnsi" w:eastAsiaTheme="minorEastAsia" w:csTheme="minorBidi"/>
+                <w:sz w:val="17"/>
+                <w:szCs w:val="22"/>
+              </w:rPr>
+              <w:t>총인구 정점</w:t>
+            </w:r>
+          </w:p>
+        </w:tc>
+        <w:tc>
+          <w:tcPr>
+            <w:tcW w:w="1008" w:type="dxa"/>
+            <w:tcBorders>
+              <w:top w:val="single" w:sz="4" w:space="0" w:color="D3D3D3"/>
+              <w:left w:val="none"/>
+              <w:bottom w:val="single" w:sz="4" w:space="0" w:color="D3D3D3"/>
+              <w:right w:val="none"/>
+            </w:tcBorders>
+            <w:shd w:val="clear" w:fill="F2F4F8"/>
+            <w:tcMar>
+              <w:top w:w="0" w:type="dxa"/>
+              <w:left w:w="108" w:type="dxa"/>
+              <w:bottom w:w="0" w:type="dxa"/>
+              <w:right w:w="108" w:type="dxa"/>
+            </w:tcMar>
+          </w:tcPr>
+          <w:p>
+            <w:pPr>
+              <w:jc w:val="center"/>
+            </w:pPr>
+            <w:r>
+              <w:rPr>
+                <w:rFonts w:ascii="Cambria" w:hAnsi="Cambria" w:eastAsia="ＭＳ 明朝" w:cs="Cambria" w:asciiTheme="minorHAnsi" w:hAnsiTheme="minorHAnsi" w:eastAsiaTheme="minorEastAsia" w:csTheme="minorBidi"/>
+                <w:sz w:val="17"/>
+                <w:szCs w:val="22"/>
+              </w:rPr>
+              <w:t>2019.11</w:t>
+            </w:r>
+          </w:p>
+        </w:tc>
+        <w:tc>
+          <w:tcPr>
+            <w:tcW w:w="1584" w:type="dxa"/>
+            <w:tcBorders>
+              <w:top w:val="single" w:sz="4" w:space="0" w:color="D3D3D3"/>
+              <w:left w:val="none"/>
+              <w:bottom w:val="single" w:sz="4" w:space="0" w:color="D3D3D3"/>
+              <w:right w:val="none"/>
+            </w:tcBorders>
+            <w:shd w:val="clear" w:fill="F2F4F8"/>
+            <w:tcMar>
+              <w:top w:w="0" w:type="dxa"/>
+              <w:left w:w="108" w:type="dxa"/>
+              <w:bottom w:w="0" w:type="dxa"/>
+              <w:right w:w="108" w:type="dxa"/>
+            </w:tcMar>
+          </w:tcPr>
+          <w:p>
+            <w:pPr>
+              <w:jc w:val="right"/>
+            </w:pPr>
+            <w:r>
+              <w:rPr>
+                <w:rFonts w:ascii="Cambria" w:hAnsi="Cambria" w:eastAsia="ＭＳ 明朝" w:cs="Cambria" w:asciiTheme="minorHAnsi" w:hAnsiTheme="minorHAnsi" w:eastAsiaTheme="minorEastAsia" w:csTheme="minorBidi"/>
+                <w:sz w:val="17"/>
+                <w:szCs w:val="22"/>
+              </w:rPr>
+              <w:t>25,866,604명</w:t>
+            </w:r>
+          </w:p>
+        </w:tc>
+        <w:tc>
+          <w:tcPr>
+            <w:tcW w:w="1584" w:type="dxa"/>
+            <w:tcBorders>
+              <w:top w:val="single" w:sz="4" w:space="0" w:color="D3D3D3"/>
+              <w:left w:val="none"/>
+              <w:bottom w:val="single" w:sz="4" w:space="0" w:color="D3D3D3"/>
+              <w:right w:val="none"/>
+            </w:tcBorders>
+            <w:shd w:val="clear" w:fill="F2F4F8"/>
+            <w:tcMar>
+              <w:top w:w="0" w:type="dxa"/>
+              <w:left w:w="108" w:type="dxa"/>
+              <w:bottom w:w="0" w:type="dxa"/>
+              <w:right w:w="108" w:type="dxa"/>
+            </w:tcMar>
+          </w:tcPr>
+          <w:p>
+            <w:pPr>
+              <w:jc w:val="right"/>
+            </w:pPr>
+            <w:r>
+              <w:rPr>
+                <w:rFonts w:ascii="Cambria" w:hAnsi="Cambria" w:eastAsia="ＭＳ 明朝" w:cs="Cambria" w:asciiTheme="minorHAnsi" w:hAnsiTheme="minorHAnsi" w:eastAsiaTheme="minorEastAsia" w:csTheme="minorBidi"/>
+                <w:sz w:val="17"/>
+                <w:szCs w:val="22"/>
+              </w:rPr>
+              <w:t>25,984,823명</w:t>
+            </w:r>
+          </w:p>
+        </w:tc>
+        <w:tc>
+          <w:tcPr>
+            <w:tcW w:w="1584" w:type="dxa"/>
+            <w:tcBorders>
+              <w:top w:val="single" w:sz="4" w:space="0" w:color="D3D3D3"/>
+              <w:left w:val="none"/>
+              <w:bottom w:val="single" w:sz="4" w:space="0" w:color="D3D3D3"/>
+              <w:right w:val="none"/>
+            </w:tcBorders>
+            <w:shd w:val="clear" w:fill="F2F4F8"/>
+            <w:tcMar>
+              <w:top w:w="0" w:type="dxa"/>
+              <w:left w:w="108" w:type="dxa"/>
+              <w:bottom w:w="0" w:type="dxa"/>
+              <w:right w:w="108" w:type="dxa"/>
+            </w:tcMar>
+          </w:tcPr>
+          <w:p>
+            <w:pPr>
+              <w:jc w:val="right"/>
+            </w:pPr>
+            <w:r>
+              <w:rPr>
+                <w:rFonts w:ascii="Cambria" w:hAnsi="Cambria" w:eastAsia="ＭＳ 明朝" w:cs="Cambria" w:asciiTheme="minorHAnsi" w:hAnsiTheme="minorHAnsi" w:eastAsiaTheme="minorEastAsia" w:csTheme="minorBidi"/>
+                <w:sz w:val="17"/>
+                <w:szCs w:val="22"/>
+              </w:rPr>
+              <w:t>51,851,427명</w:t>
+            </w:r>
+          </w:p>
+        </w:tc>
+        <w:tc>
+          <w:tcPr>
+            <w:tcW w:w="2592" w:type="dxa"/>
+            <w:tcBorders>
+              <w:top w:val="single" w:sz="4" w:space="0" w:color="D3D3D3"/>
+              <w:left w:val="none"/>
+              <w:bottom w:val="single" w:sz="4" w:space="0" w:color="D3D3D3"/>
+              <w:right w:val="none"/>
+            </w:tcBorders>
+            <w:shd w:val="clear" w:fill="F2F4F8"/>
+            <w:tcMar>
+              <w:top w:w="0" w:type="dxa"/>
+              <w:left w:w="108" w:type="dxa"/>
+              <w:bottom w:w="0" w:type="dxa"/>
+              <w:right w:w="108" w:type="dxa"/>
+            </w:tcMar>
+          </w:tcPr>
+          <w:p>
+            <w:pPr>
+              <w:jc w:val="left"/>
+            </w:pPr>
+            <w:r>
+              <w:rPr>
+                <w:rFonts w:ascii="Cambria" w:hAnsi="Cambria" w:eastAsia="ＭＳ 明朝" w:cs="Cambria" w:asciiTheme="minorHAnsi" w:hAnsiTheme="minorHAnsi" w:eastAsiaTheme="minorEastAsia" w:csTheme="minorBidi"/>
+                <w:sz w:val="17"/>
+                <w:szCs w:val="22"/>
+              </w:rPr>
+              <w:t>역대 최대 인구 기록 후 감소 전환</w:t>
+            </w:r>
+          </w:p>
+        </w:tc>
+      </w:tr>
+      <w:tr>
+        <w:tc>
+          <w:tcPr>
+            <w:tcW w:w="1296" w:type="dxa"/>
+            <w:tcBorders>
+              <w:top w:val="single" w:sz="4" w:space="0" w:color="D3D3D3"/>
+              <w:left w:val="none"/>
+              <w:bottom w:val="single" w:sz="4" w:space="0" w:color="D3D3D3"/>
+              <w:right w:val="none"/>
+            </w:tcBorders>
+            <w:shd w:val="clear" w:fill="FFFFFF"/>
+            <w:tcMar>
+              <w:top w:w="0" w:type="dxa"/>
+              <w:left w:w="108" w:type="dxa"/>
+              <w:bottom w:w="0" w:type="dxa"/>
+              <w:right w:w="108" w:type="dxa"/>
+            </w:tcMar>
+          </w:tcPr>
+          <w:p>
+            <w:pPr>
+              <w:jc w:val="center"/>
+            </w:pPr>
+            <w:r>
+              <w:rPr>
+                <w:rFonts w:ascii="Cambria" w:hAnsi="Cambria" w:eastAsia="ＭＳ 明朝" w:cs="Cambria" w:asciiTheme="minorHAnsi" w:hAnsiTheme="minorHAnsi" w:eastAsiaTheme="minorEastAsia" w:csTheme="minorBidi"/>
+                <w:sz w:val="17"/>
+                <w:szCs w:val="22"/>
+              </w:rPr>
+              <w:t>최근 시점</w:t>
+            </w:r>
+          </w:p>
+        </w:tc>
+        <w:tc>
+          <w:tcPr>
+            <w:tcW w:w="1008" w:type="dxa"/>
+            <w:tcBorders>
+              <w:top w:val="single" w:sz="4" w:space="0" w:color="D3D3D3"/>
+              <w:left w:val="none"/>
+              <w:bottom w:val="single" w:sz="4" w:space="0" w:color="D3D3D3"/>
+              <w:right w:val="none"/>
+            </w:tcBorders>
+            <w:shd w:val="clear" w:fill="FFFFFF"/>
+            <w:tcMar>
+              <w:top w:w="0" w:type="dxa"/>
+              <w:left w:w="108" w:type="dxa"/>
+              <w:bottom w:w="0" w:type="dxa"/>
+              <w:right w:w="108" w:type="dxa"/>
+            </w:tcMar>
+          </w:tcPr>
+          <w:p>
+            <w:pPr>
+              <w:jc w:val="center"/>
+            </w:pPr>
+            <w:r>
+              <w:rPr>
+                <w:rFonts w:ascii="Cambria" w:hAnsi="Cambria" w:eastAsia="ＭＳ 明朝" w:cs="Cambria" w:asciiTheme="minorHAnsi" w:hAnsiTheme="minorHAnsi" w:eastAsiaTheme="minorEastAsia" w:csTheme="minorBidi"/>
+                <w:sz w:val="17"/>
+                <w:szCs w:val="22"/>
+              </w:rPr>
+              <w:t>2026.06</w:t>
+            </w:r>
+          </w:p>
+        </w:tc>
+        <w:tc>
+          <w:tcPr>
+            <w:tcW w:w="1584" w:type="dxa"/>
+            <w:tcBorders>
+              <w:top w:val="single" w:sz="4" w:space="0" w:color="D3D3D3"/>
+              <w:left w:val="none"/>
+              <w:bottom w:val="single" w:sz="4" w:space="0" w:color="D3D3D3"/>
+              <w:right w:val="none"/>
+            </w:tcBorders>
+            <w:shd w:val="clear" w:fill="FFFFFF"/>
+            <w:tcMar>
+              <w:top w:w="0" w:type="dxa"/>
+              <w:left w:w="108" w:type="dxa"/>
+              <w:bottom w:w="0" w:type="dxa"/>
+              <w:right w:w="108" w:type="dxa"/>
+            </w:tcMar>
+          </w:tcPr>
+          <w:p>
+            <w:pPr>
+              <w:jc w:val="right"/>
+            </w:pPr>
+            <w:r>
+              <w:rPr>
+                <w:rFonts w:ascii="Cambria" w:hAnsi="Cambria" w:eastAsia="ＭＳ 明朝" w:cs="Cambria" w:asciiTheme="minorHAnsi" w:hAnsiTheme="minorHAnsi" w:eastAsiaTheme="minorEastAsia" w:csTheme="minorBidi"/>
+                <w:sz w:val="17"/>
+                <w:szCs w:val="22"/>
+              </w:rPr>
+              <w:t>25,418,248명</w:t>
+            </w:r>
+          </w:p>
+        </w:tc>
+        <w:tc>
+          <w:tcPr>
+            <w:tcW w:w="1584" w:type="dxa"/>
+            <w:tcBorders>
+              <w:top w:val="single" w:sz="4" w:space="0" w:color="D3D3D3"/>
+              <w:left w:val="none"/>
+              <w:bottom w:val="single" w:sz="4" w:space="0" w:color="D3D3D3"/>
+              <w:right w:val="none"/>
+            </w:tcBorders>
+            <w:shd w:val="clear" w:fill="FFFFFF"/>
+            <w:tcMar>
+              <w:top w:w="0" w:type="dxa"/>
+              <w:left w:w="108" w:type="dxa"/>
+              <w:bottom w:w="0" w:type="dxa"/>
+              <w:right w:w="108" w:type="dxa"/>
+            </w:tcMar>
+          </w:tcPr>
+          <w:p>
+            <w:pPr>
+              <w:jc w:val="right"/>
+            </w:pPr>
+            <w:r>
+              <w:rPr>
+                <w:rFonts w:ascii="Cambria" w:hAnsi="Cambria" w:eastAsia="ＭＳ 明朝" w:cs="Cambria" w:asciiTheme="minorHAnsi" w:hAnsiTheme="minorHAnsi" w:eastAsiaTheme="minorEastAsia" w:csTheme="minorBidi"/>
+                <w:sz w:val="17"/>
+                <w:szCs w:val="22"/>
+              </w:rPr>
+              <w:t>25,673,521명</w:t>
+            </w:r>
+          </w:p>
+        </w:tc>
+        <w:tc>
+          <w:tcPr>
+            <w:tcW w:w="1584" w:type="dxa"/>
+            <w:tcBorders>
+              <w:top w:val="single" w:sz="4" w:space="0" w:color="D3D3D3"/>
+              <w:left w:val="none"/>
+              <w:bottom w:val="single" w:sz="4" w:space="0" w:color="D3D3D3"/>
+              <w:right w:val="none"/>
+            </w:tcBorders>
+            <w:shd w:val="clear" w:fill="FFFFFF"/>
+            <w:tcMar>
+              <w:top w:w="0" w:type="dxa"/>
+              <w:left w:w="108" w:type="dxa"/>
+              <w:bottom w:w="0" w:type="dxa"/>
+              <w:right w:w="108" w:type="dxa"/>
+            </w:tcMar>
+          </w:tcPr>
+          <w:p>
+            <w:pPr>
+              <w:jc w:val="right"/>
+            </w:pPr>
+            <w:r>
+              <w:rPr>
+                <w:rFonts w:ascii="Cambria" w:hAnsi="Cambria" w:eastAsia="ＭＳ 明朝" w:cs="Cambria" w:asciiTheme="minorHAnsi" w:hAnsiTheme="minorHAnsi" w:eastAsiaTheme="minorEastAsia" w:csTheme="minorBidi"/>
+                <w:sz w:val="17"/>
+                <w:szCs w:val="22"/>
+              </w:rPr>
+              <w:t>51,091,769명</w:t>
+            </w:r>
+          </w:p>
+        </w:tc>
+        <w:tc>
+          <w:tcPr>
+            <w:tcW w:w="2592" w:type="dxa"/>
+            <w:tcBorders>
+              <w:top w:val="single" w:sz="4" w:space="0" w:color="D3D3D3"/>
+              <w:left w:val="none"/>
+              <w:bottom w:val="single" w:sz="4" w:space="0" w:color="D3D3D3"/>
+              <w:right w:val="none"/>
+            </w:tcBorders>
+            <w:shd w:val="clear" w:fill="FFFFFF"/>
+            <w:tcMar>
+              <w:top w:w="0" w:type="dxa"/>
+              <w:left w:w="108" w:type="dxa"/>
+              <w:bottom w:w="0" w:type="dxa"/>
+              <w:right w:w="108" w:type="dxa"/>
+            </w:tcMar>
+          </w:tcPr>
+          <w:p>
+            <w:pPr>
+              <w:jc w:val="left"/>
+            </w:pPr>
+            <w:r>
+              <w:rPr>
+                <w:rFonts w:ascii="Cambria" w:hAnsi="Cambria" w:eastAsia="ＭＳ 明朝" w:cs="Cambria" w:asciiTheme="minorHAnsi" w:hAnsiTheme="minorHAnsi" w:eastAsiaTheme="minorEastAsia" w:csTheme="minorBidi"/>
+                <w:sz w:val="17"/>
+                <w:szCs w:val="22"/>
+              </w:rPr>
+              <w:t>자연감소 지속 (정점 대비 -76만)</w:t>
+            </w:r>
+          </w:p>
+        </w:tc>
+      </w:tr>
+      <w:tr>
+        <w:tc>
+          <w:tcPr>
+            <w:tcW w:w="1296" w:type="dxa"/>
+            <w:tcBorders>
+              <w:top w:val="single" w:sz="4" w:space="0" w:color="D3D3D3"/>
+              <w:left w:val="none"/>
+              <w:bottom w:val="single" w:sz="6" w:space="0" w:color="2B4C7E"/>
+              <w:right w:val="none"/>
+            </w:tcBorders>
+            <w:shd w:val="clear" w:fill="FFF2E6"/>
+            <w:tcMar>
+              <w:top w:w="0" w:type="dxa"/>
+              <w:left w:w="108" w:type="dxa"/>
+              <w:bottom w:w="0" w:type="dxa"/>
+              <w:right w:w="108" w:type="dxa"/>
+            </w:tcMar>
+          </w:tcPr>
+          <w:p>
+            <w:pPr>
+              <w:jc w:val="center"/>
+            </w:pPr>
+            <w:r>
+              <w:rPr>
+                <w:rFonts w:ascii="Cambria" w:hAnsi="Cambria" w:eastAsia="ＭＳ 明朝" w:cs="Cambria" w:asciiTheme="minorHAnsi" w:hAnsiTheme="minorHAnsi" w:eastAsiaTheme="minorEastAsia" w:csTheme="minorBidi"/>
+                <w:b/>
+                <w:bCs/>
+                <w:sz w:val="17"/>
+                <w:szCs w:val="22"/>
+              </w:rPr>
+              <w:t>2030 예측</w:t>
+            </w:r>
+          </w:p>
+        </w:tc>
+        <w:tc>
+          <w:tcPr>
+            <w:tcW w:w="1008" w:type="dxa"/>
+            <w:tcBorders>
+              <w:top w:val="single" w:sz="4" w:space="0" w:color="D3D3D3"/>
+              <w:left w:val="none"/>
+              <w:bottom w:val="single" w:sz="6" w:space="0" w:color="2B4C7E"/>
+              <w:right w:val="none"/>
+            </w:tcBorders>
+            <w:shd w:val="clear" w:fill="FFF2E6"/>
+            <w:tcMar>
+              <w:top w:w="0" w:type="dxa"/>
+              <w:left w:w="108" w:type="dxa"/>
+              <w:bottom w:w="0" w:type="dxa"/>
+              <w:right w:w="108" w:type="dxa"/>
+            </w:tcMar>
+          </w:tcPr>
+          <w:p>
+            <w:pPr>
+              <w:jc w:val="center"/>
+            </w:pPr>
+            <w:r>
+              <w:rPr>
+                <w:rFonts w:ascii="Cambria" w:hAnsi="Cambria" w:eastAsia="ＭＳ 明朝" w:cs="Cambria" w:asciiTheme="minorHAnsi" w:hAnsiTheme="minorHAnsi" w:eastAsiaTheme="minorEastAsia" w:csTheme="minorBidi"/>
+                <w:b/>
+                <w:bCs/>
+                <w:sz w:val="17"/>
+                <w:szCs w:val="22"/>
+              </w:rPr>
+              <w:t>2030.01</w:t>
+            </w:r>
+          </w:p>
+        </w:tc>
+        <w:tc>
+          <w:tcPr>
+            <w:tcW w:w="1584" w:type="dxa"/>
+            <w:tcBorders>
+              <w:top w:val="single" w:sz="4" w:space="0" w:color="D3D3D3"/>
+              <w:left w:val="none"/>
+              <w:bottom w:val="single" w:sz="6" w:space="0" w:color="2B4C7E"/>
+              <w:right w:val="none"/>
+            </w:tcBorders>
+            <w:shd w:val="clear" w:fill="FFF2E6"/>
+            <w:tcMar>
+              <w:top w:w="0" w:type="dxa"/>
+              <w:left w:w="108" w:type="dxa"/>
+              <w:bottom w:w="0" w:type="dxa"/>
+              <w:right w:w="108" w:type="dxa"/>
+            </w:tcMar>
+          </w:tcPr>
+          <w:p>
+            <w:pPr>
+              <w:jc w:val="right"/>
+            </w:pPr>
+            <w:r>
+              <w:rPr>
+                <w:rFonts w:ascii="Cambria" w:hAnsi="Cambria" w:eastAsia="ＭＳ 明朝" w:cs="Cambria" w:asciiTheme="minorHAnsi" w:hAnsiTheme="minorHAnsi" w:eastAsiaTheme="minorEastAsia" w:csTheme="minorBidi"/>
+                <w:b/>
+                <w:bCs/>
+                <w:sz w:val="17"/>
+                <w:szCs w:val="22"/>
+              </w:rPr>
+              <w:t>24,657,516명</w:t>
+            </w:r>
+          </w:p>
+        </w:tc>
+        <w:tc>
+          <w:tcPr>
+            <w:tcW w:w="1584" w:type="dxa"/>
+            <w:tcBorders>
+              <w:top w:val="single" w:sz="4" w:space="0" w:color="D3D3D3"/>
+              <w:left w:val="none"/>
+              <w:bottom w:val="single" w:sz="6" w:space="0" w:color="2B4C7E"/>
+              <w:right w:val="none"/>
+            </w:tcBorders>
+            <w:shd w:val="clear" w:fill="FFF2E6"/>
+            <w:tcMar>
+              <w:top w:w="0" w:type="dxa"/>
+              <w:left w:w="108" w:type="dxa"/>
+              <w:bottom w:w="0" w:type="dxa"/>
+              <w:right w:w="108" w:type="dxa"/>
+            </w:tcMar>
+          </w:tcPr>
+          <w:p>
+            <w:pPr>
+              <w:jc w:val="right"/>
+            </w:pPr>
+            <w:r>
+              <w:rPr>
+                <w:rFonts w:ascii="Cambria" w:hAnsi="Cambria" w:eastAsia="ＭＳ 明朝" w:cs="Cambria" w:asciiTheme="minorHAnsi" w:hAnsiTheme="minorHAnsi" w:eastAsiaTheme="minorEastAsia" w:csTheme="minorBidi"/>
+                <w:b/>
+                <w:bCs/>
+                <w:sz w:val="17"/>
+                <w:szCs w:val="22"/>
+              </w:rPr>
+              <w:t>24,979,259명</w:t>
+            </w:r>
+          </w:p>
+        </w:tc>
+        <w:tc>
+          <w:tcPr>
+            <w:tcW w:w="1584" w:type="dxa"/>
+            <w:tcBorders>
+              <w:top w:val="single" w:sz="4" w:space="0" w:color="D3D3D3"/>
+              <w:left w:val="none"/>
+              <w:bottom w:val="single" w:sz="6" w:space="0" w:color="2B4C7E"/>
+              <w:right w:val="none"/>
+            </w:tcBorders>
+            <w:shd w:val="clear" w:fill="FFF2E6"/>
+            <w:tcMar>
+              <w:top w:w="0" w:type="dxa"/>
+              <w:left w:w="108" w:type="dxa"/>
+              <w:bottom w:w="0" w:type="dxa"/>
+              <w:right w:w="108" w:type="dxa"/>
+            </w:tcMar>
+          </w:tcPr>
+          <w:p>
+            <w:pPr>
+              <w:jc w:val="right"/>
+            </w:pPr>
+            <w:r>
+              <w:rPr>
+                <w:rFonts w:ascii="Cambria" w:hAnsi="Cambria" w:eastAsia="ＭＳ 明朝" w:cs="Cambria" w:asciiTheme="minorHAnsi" w:hAnsiTheme="minorHAnsi" w:eastAsiaTheme="minorEastAsia" w:csTheme="minorBidi"/>
+                <w:b/>
+                <w:bCs/>
+                <w:sz w:val="17"/>
+                <w:szCs w:val="22"/>
+              </w:rPr>
+              <w:t>49,636,775명</w:t>
+            </w:r>
+          </w:p>
+        </w:tc>
+        <w:tc>
+          <w:tcPr>
+            <w:tcW w:w="2592" w:type="dxa"/>
+            <w:tcBorders>
+              <w:top w:val="single" w:sz="4" w:space="0" w:color="D3D3D3"/>
+              <w:left w:val="none"/>
+              <w:bottom w:val="single" w:sz="6" w:space="0" w:color="2B4C7E"/>
+              <w:right w:val="none"/>
+            </w:tcBorders>
+            <w:shd w:val="clear" w:fill="FFF2E6"/>
+            <w:tcMar>
+              <w:top w:w="0" w:type="dxa"/>
+              <w:left w:w="108" w:type="dxa"/>
+              <w:bottom w:w="0" w:type="dxa"/>
+              <w:right w:w="108" w:type="dxa"/>
+            </w:tcMar>
+          </w:tcPr>
+          <w:p>
+            <w:pPr>
+              <w:jc w:val="left"/>
+            </w:pPr>
+            <w:r>
+              <w:rPr>
+                <w:rFonts w:ascii="Cambria" w:hAnsi="Cambria" w:eastAsia="ＭＳ 明朝" w:cs="Cambria" w:asciiTheme="minorHAnsi" w:hAnsiTheme="minorHAnsi" w:eastAsiaTheme="minorEastAsia" w:csTheme="minorBidi"/>
+                <w:b/>
+                <w:bCs/>
+                <w:sz w:val="17"/>
+                <w:szCs w:val="22"/>
+              </w:rPr>
+              <w:t>5천만 명선 붕괴 (정점 대비 -221만)</w:t>
+            </w:r>
+          </w:p>
+        </w:tc>
+      </w:tr>
+    </w:tbl>
+    <w:p>
+      <w:pPr>
+        <w:spacing w:after="120" w:line="324" w:lineRule="auto"/>
+        <w:jc w:val="center"/>
       </w:pPr>
       <w:r>
         <w:drawing>
@@ -110,7 +1387,7 @@
                     <pic:cNvPicPr/>
                   </pic:nvPicPr>
                   <pic:blipFill>
-                    <a:blip r:embed="rId10"/>
+                    <a:blip r:embed="rId11"/>
                     <a:stretch>
                       <a:fillRect/>
                     </a:stretch>
@@ -133,14 +1410,32 @@
     </w:p>
     <w:p>
       <w:pPr>
-        <w:pStyle w:val="Heading1"/>
+        <w:spacing w:after="120" w:line="324" w:lineRule="auto"/>
+        <w:jc w:val="center"/>
       </w:pPr>
       <w:r>
         <w:rPr>
-          <w:rFonts w:ascii="Calibri" w:hAnsi="Calibri" w:eastAsia="ＭＳ ゴシック" w:cs="Calibri" w:asciiTheme="majorHAnsi" w:hAnsiTheme="majorHAnsi" w:eastAsiaTheme="majorEastAsia" w:csTheme="majorBidi"/>
+          <w:rFonts w:ascii="Cambria" w:hAnsi="Cambria" w:eastAsia="ＭＳ 明朝" w:cs="Cambria" w:asciiTheme="minorHAnsi" w:hAnsiTheme="minorHAnsi" w:eastAsiaTheme="minorEastAsia" w:csTheme="minorBidi"/>
+          <w:i/>
+          <w:iCs/>
+          <w:color w:val="595959"/>
+          <w:sz w:val="18"/>
+          <w:szCs w:val="22"/>
+        </w:rPr>
+        <w:t>&lt;그림 1&gt; 대한민국 남녀 인구수 변화 추이 및 2030년 다항 회귀 예측 그래프</w:t>
+      </w:r>
+    </w:p>
+    <w:p>
+      <w:pPr>
+        <w:pStyle w:val="Heading1"/>
+        <w:spacing w:before="240" w:after="120"/>
+      </w:pPr>
+      <w:r>
+        <w:rPr>
+          <w:rFonts w:ascii="Calibri" w:hAnsi="Calibri" w:eastAsia="ＭＳ ゴシック" w:cs="Calibri" w:asciiTheme="majorHAnsi" w:hAnsiTheme="majorHAnsi" w:eastAsiaTheme="majorEastAsia"/>
           <w:b/>
           <w:bCs/>
-          <w:color w:val="365F91" w:themeColor="accent1" w:themeShade="BF"/>
+          <w:color w:val="1F3864"/>
           <w:sz w:val="28"/>
           <w:szCs w:val="28"/>
         </w:rPr>
@@ -149,7 +1444,7 @@
     </w:p>
     <w:p>
       <w:pPr>
-        <w:spacing w:after="200" w:line="276" w:lineRule="auto"/>
+        <w:spacing w:after="120" w:line="324" w:lineRule="auto"/>
       </w:pPr>
       <w:r>
         <w:rPr>
@@ -157,19 +1452,33 @@
           <w:sz w:val="22"/>
           <w:szCs w:val="22"/>
         </w:rPr>
-        <w:t>데이터에서 눈에 띄는 두 가지 현상은 '여성 인구가 남성 인구를 추월한 것'과 '전체 인구수의 지속적인 감소'입니다. 첫째, 여성 인구가 남성을 추월한 현상(여초 현상)의 주된 원인은 고령화와 사회적 인식 변화에 있습니다. 과거 우리 사회에 뿌리 깊게 자리 잡고 있던 '남아선호사상'이 점차 퇴화하면서 남녀 성비 불균형이 해소되었고, 여기에 여성의 기대 수명이 남성보다 길다는 생물학적 특징이 더해졌습니다. 고령화 사회로 진입하면서 노년층의 비중이 커졌고, 이 노년층에서 여성의 비율이 압도적으로 높기 때문에 결과적으로 전체 인구에서도 여성이 더 많아지게 되었습니다. 둘째, 전체 인구수가 줄어드는 주된 원인은 심각한 '저출산'입니다. 청년층이 겪고 있는 높은 주거비와 사교육비, 그리고 치열한 취업난 등 경제적 부담이 커지면서 결혼과 출산을 기피하는 가치관 변화가 인구 감소로 직결되었습니다.</w:t>
+        <w:t>데이터에서 나타난 첫 번째 주목할 변화는 여성 인구가 남성 인구를 추월한 이른바 '여초 현상'의 고착화입니다. 과거 한국 사회는 뿌리 깊은 남아선호사상으로 인해 출생 성비 불균형(여아 100명당 남아 110명 이상)이 심각했으나, 성평등 인식 확산과 가치관 변화로 자연 성비 수준을 회복했습니다. 여기에 결정적으로 작용한 것은 가속화된 고령화입니다. 데이터베이스를 세부 분석한 결과, 2015년 6월(남성 2,571만 5,304명, 여성 2,571만 5,796명)을 기점으로 대한민국 정부 수립 이래 최초로 여성 인구가 남성을 앞질렀습니다. 여성의 평균 기대수명이 남성보다 약 6년가량 길기 때문에, 65세 이상 및 80세 이상 초고령 인구에서 여성이 차지하는 비중이 압도적으로 높아지며 전체 인구 구조의 성비를 여초로 이끌었습니다.</w:t>
+      </w:r>
+    </w:p>
+    <w:p>
+      <w:pPr>
+        <w:spacing w:after="120" w:line="324" w:lineRule="auto"/>
+      </w:pPr>
+      <w:r>
+        <w:rPr>
+          <w:rFonts w:ascii="Cambria" w:hAnsi="Cambria" w:eastAsia="ＭＳ 明朝" w:cs="Cambria" w:asciiTheme="minorHAnsi" w:hAnsiTheme="minorHAnsi" w:eastAsiaTheme="minorEastAsia" w:csTheme="minorBidi"/>
+          <w:sz w:val="22"/>
+          <w:szCs w:val="22"/>
+        </w:rPr>
+        <w:t>두 번째 핵심 현상은 2019년 말 정점(5,185만 명)을 기록한 이후 시작된 '총인구의 가파른 자연 감소'입니다. 사망자 수가 출생아 수를 넘어서는 인구 데드크로스가 현실화된 근본 원인은 청년층의 초저출산 현상에 있습니다. 청년 세대가 체감하는 수도권의 높은 주거비 장벽, 양질의 일자리 부족과 노동 시장의 양극화, 치열한 사교육비 부담은 결혼과 출산에 대한 심리적·경제적 진입장벽을 극도로 높였습니다. 이는 단순한 개인의 가치관 변화라기보다, 미래에 대한 불안정성이 청년 세대로 하여금 출산을 유예하거나 단념하게 만든 구조적 결과입니다.</w:t>
       </w:r>
     </w:p>
     <w:p>
       <w:pPr>
         <w:pStyle w:val="Heading1"/>
+        <w:spacing w:before="240" w:after="120"/>
       </w:pPr>
       <w:r>
         <w:rPr>
-          <w:rFonts w:ascii="Calibri" w:hAnsi="Calibri" w:eastAsia="ＭＳ ゴシック" w:cs="Calibri" w:asciiTheme="majorHAnsi" w:hAnsiTheme="majorHAnsi" w:eastAsiaTheme="majorEastAsia" w:csTheme="majorBidi"/>
+          <w:rFonts w:ascii="Calibri" w:hAnsi="Calibri" w:eastAsia="ＭＳ ゴシック" w:cs="Calibri" w:asciiTheme="majorHAnsi" w:hAnsiTheme="majorHAnsi" w:eastAsiaTheme="majorEastAsia"/>
           <w:b/>
           <w:bCs/>
-          <w:color w:val="365F91" w:themeColor="accent1" w:themeShade="BF"/>
+          <w:color w:val="1F3864"/>
           <w:sz w:val="28"/>
           <w:szCs w:val="28"/>
         </w:rPr>
@@ -178,7 +1487,7 @@
     </w:p>
     <w:p>
       <w:pPr>
-        <w:spacing w:after="200" w:line="276" w:lineRule="auto"/>
+        <w:spacing w:after="120" w:line="324" w:lineRule="auto"/>
       </w:pPr>
       <w:r>
         <w:rPr>
@@ -186,19 +1495,46 @@
           <w:sz w:val="22"/>
           <w:szCs w:val="22"/>
         </w:rPr>
-        <w:t>이러한 데이터 분석 결과를 통해 도출할 수 있는 가장 큰 사회적 문제점은 생산가능인구(15~64세)의 감소와 노년층 인구의 증가로 인한 '부양비 증가'입니다. 전체 인구가 줄어듦과 동시에 경제 활동을 할 수 있는 젊은 층은 줄어들고 부양해야 할 노년층은 늘어나면서, 청년 세대의 세금 및 복지 비용 부담이 기하급수적으로 커지게 됩니다. 이는 결국 국가의 경제 성장률 둔화와 국가 경쟁력 하락으로 이어지는 심각한 위기를 초래합니다.</w:t>
+        <w:t>가장 직접적이고 파괴적인 문제는 생산연령인구(15~64세)의 급감과 노년부양비의 급증입니다. 경제 활동에 참여하여 부가가치를 창출하고 세금을 납부할 주체는 줄어드는 반면, 의료와 연금 등 사회적 돌봄이 필요한 고령 인구는 가파르게 늘어납니다. 이는 일하는 청장년층의 조세 및 사회보험료 부담을 눈덩이처럼 불려 세대 간 심각한 갈등을 초래하며, 장기적으로는 국민연금 및 건강보험 제도의 재정 건전성을 위협합니다.</w:t>
+      </w:r>
+    </w:p>
+    <w:p>
+      <w:pPr>
+        <w:spacing w:after="120" w:line="324" w:lineRule="auto"/>
+      </w:pPr>
+      <w:r>
+        <w:rPr>
+          <w:rFonts w:ascii="Cambria" w:hAnsi="Cambria" w:eastAsia="ＭＳ 明朝" w:cs="Cambria" w:asciiTheme="minorHAnsi" w:hAnsiTheme="minorHAnsi" w:eastAsiaTheme="minorEastAsia" w:csTheme="minorBidi"/>
+          <w:sz w:val="22"/>
+          <w:szCs w:val="22"/>
+        </w:rPr>
+        <w:t>국토의 공간적 차원에서는 '지방소멸'의 위기가 현실로 다가오고 있습니다. 인구 감소 충격은 전국에 균등하게 발생하지 않고 비수도권 지역에 집중되고 있습니다. 청년 인구가 일자리와 인프라를 찾아 수도권으로 지속적으로 유출되면서, 지방 도시들은 학령인구 급감으로 초·중·고교 및 지방대학이 폐교 위기에 처하고, 산부인과·응급실 등 필수 의료와 대중교통망이 붕괴되는 악순환에 빠져들고 있습니다.</w:t>
+      </w:r>
+    </w:p>
+    <w:p>
+      <w:pPr>
+        <w:spacing w:after="120" w:line="324" w:lineRule="auto"/>
+      </w:pPr>
+      <w:r>
+        <w:rPr>
+          <w:rFonts w:ascii="Cambria" w:hAnsi="Cambria" w:eastAsia="ＭＳ 明朝" w:cs="Cambria" w:asciiTheme="minorHAnsi" w:hAnsiTheme="minorHAnsi" w:eastAsiaTheme="minorEastAsia" w:csTheme="minorBidi"/>
+          <w:sz w:val="22"/>
+          <w:szCs w:val="22"/>
+        </w:rPr>
+        <w:t>거시경제와 국가 안보 측면에서도 복합적인 타격이 예상됩니다. 생산가능인구의 축소와 소비 심리 위축은 내수 시장을 정체시켜 국가 잠재성장률을 지속적으로 하락시킵니다. 나아가 군 입대 대상인 20대 남성 인구의 가파른 감소는 상비 병력 유지에 차질을 빚어 국방 안보 체계 전반의 근본적인 재편을 요구하는 중대한 안보 과제로 직결됩니다.</w:t>
       </w:r>
     </w:p>
     <w:p>
       <w:pPr>
         <w:pStyle w:val="Heading1"/>
+        <w:spacing w:before="240" w:after="120"/>
       </w:pPr>
       <w:r>
         <w:rPr>
-          <w:rFonts w:ascii="Calibri" w:hAnsi="Calibri" w:eastAsia="ＭＳ ゴシック" w:cs="Calibri" w:asciiTheme="majorHAnsi" w:hAnsiTheme="majorHAnsi" w:eastAsiaTheme="majorEastAsia" w:csTheme="majorBidi"/>
+          <w:rFonts w:ascii="Calibri" w:hAnsi="Calibri" w:eastAsia="ＭＳ ゴシック" w:cs="Calibri" w:asciiTheme="majorHAnsi" w:hAnsiTheme="majorHAnsi" w:eastAsiaTheme="majorEastAsia"/>
           <w:b/>
           <w:bCs/>
-          <w:color w:val="365F91" w:themeColor="accent1" w:themeShade="BF"/>
+          <w:color w:val="1F3864"/>
           <w:sz w:val="28"/>
           <w:szCs w:val="28"/>
         </w:rPr>
@@ -207,7 +1543,7 @@
     </w:p>
     <w:p>
       <w:pPr>
-        <w:spacing w:after="200" w:line="276" w:lineRule="auto"/>
+        <w:spacing w:after="120" w:line="324" w:lineRule="auto"/>
       </w:pPr>
       <w:r>
         <w:rPr>
@@ -215,19 +1551,59 @@
           <w:sz w:val="22"/>
           <w:szCs w:val="22"/>
         </w:rPr>
-        <w:t>이를 해결하기 위해서는 다각적인 정책이 필요합니다. 첫째, 주거 안정과 양육비 지원을 대폭 강화하여 청년층이 경제적 부담 없이 출산을 계획할 수 있는 환경을 만들어야 합니다. 둘째, 유연근무제 확대 및 남녀 모두의 눈치 보지 않는 육아휴직 등 일과 가정이 양립할 수 있는 실질적인 기업 문화를 조성해야 합니다. 셋째, 생산가능인구 부족을 메우기 위해 노인들의 건강과 능력을 활용하는 시니어 일자리를 창출하고 정년을 연장하는 방안을 고려해야 합니다. 마지막으로, 다양한 배경을 가진 우수한 외국인 인재를 적극적으로 수용하고 사회에 통합시키는 이민 정책의 재정비도 중요한 대안이 될 수 있습니다.</w:t>
+        <w:t>청년층의 실질적인 주거 안정과 일·가정 양립 문화의 조성이 선행되어야 합니다. 일회성 출산장려금 지급 위주의 정책에서 탈피하여 청년 및 신혼부부를 위한 장기 공공임대주택 공급과 저금리 전세 대출 등 체감도 높은 주거 지원책을 마련해야 합니다. 또한 남녀 모두가 직장에서 눈치 보지 않고 육아휴직을 사용하는 문화를 정착시키고, 유연근무제와 시차출퇴근제를 확대하여 일과 가정이 조화를 이룰 수 있는 실질적인 고용 환경을 뒷받침해야 합니다.</w:t>
+      </w:r>
+    </w:p>
+    <w:p>
+      <w:pPr>
+        <w:spacing w:after="120" w:line="324" w:lineRule="auto"/>
+      </w:pPr>
+      <w:r>
+        <w:rPr>
+          <w:rFonts w:ascii="Cambria" w:hAnsi="Cambria" w:eastAsia="ＭＳ 明朝" w:cs="Cambria" w:asciiTheme="minorHAnsi" w:hAnsiTheme="minorHAnsi" w:eastAsiaTheme="minorEastAsia" w:csTheme="minorBidi"/>
+          <w:sz w:val="22"/>
+          <w:szCs w:val="22"/>
+        </w:rPr>
+        <w:t>수도권 과밀을 완화하고 지역 균형 발전을 이루는 공간 전략이 요구됩니다. 청년들이 수도권으로 몰리지 않더라도 삶의 질을 누릴 수 있도록 비수도권 거점 지역에 혁신 산업 클러스터와 공공기관을 연계한 양질의 일자리를 확충해야 합니다. 지역 교육 여건과 필수 의료 체계를 촘촘히 보강하여 지방에서도 안심하고 아이를 키울 수 있는 정주 환경을 조성해야 합니다.</w:t>
+      </w:r>
+    </w:p>
+    <w:p>
+      <w:pPr>
+        <w:spacing w:after="120" w:line="324" w:lineRule="auto"/>
+      </w:pPr>
+      <w:r>
+        <w:rPr>
+          <w:rFonts w:ascii="Cambria" w:hAnsi="Cambria" w:eastAsia="ＭＳ 明朝" w:cs="Cambria" w:asciiTheme="minorHAnsi" w:hAnsiTheme="minorHAnsi" w:eastAsiaTheme="minorEastAsia" w:csTheme="minorBidi"/>
+          <w:sz w:val="22"/>
+          <w:szCs w:val="22"/>
+        </w:rPr>
+        <w:t>초고령사회로의 진입에 발맞추어 정년 연장과 세대 상생형 계속고용 제도를 도입해야 합니다. 노동 현장에서 숙련된 기술을 가진 고령 인력이 계속 일할 수 있도록 직무급 중심의 임금체계 개편과 연계한 유연한 계속고용 모델을 마련해야 합니다. 이는 생산연령인구 부족 충격을 완화함과 동시에 청년 일자리와의 충돌을 방지하며, 국민연금의 재정적 지속가능성을 높이는 중요한 완충 장치가 될 것입니다.</w:t>
+      </w:r>
+    </w:p>
+    <w:p>
+      <w:pPr>
+        <w:spacing w:after="120" w:line="324" w:lineRule="auto"/>
+      </w:pPr>
+      <w:r>
+        <w:rPr>
+          <w:rFonts w:ascii="Cambria" w:hAnsi="Cambria" w:eastAsia="ＭＳ 明朝" w:cs="Cambria" w:asciiTheme="minorHAnsi" w:hAnsiTheme="minorHAnsi" w:eastAsiaTheme="minorEastAsia" w:csTheme="minorBidi"/>
+          <w:sz w:val="22"/>
+          <w:szCs w:val="22"/>
+        </w:rPr>
+        <w:t>개방적이고 체계적인 이민 정책을 수립하여 중장기적인 인구 보완책을 마련해야 합니다. 단순 노무 인력 수급에 머무르지 않고, 첨단 산업 전문 인재와 숙련 기능 인력을 적극 유치할 수 있도록 비자 제도를 혁신해야 합니다. 나아가 유입된 외국인 주민들이 한국 사회의 당당한 구성원으로 뿌리내릴 수 있도록 한국어 교육, 다문화 가정 지원, 지역 사회 통합 프로그램을 체계적으로 확충해야 합니다.</w:t>
       </w:r>
     </w:p>
     <w:p>
       <w:pPr>
         <w:pStyle w:val="Heading1"/>
+        <w:spacing w:before="240" w:after="120"/>
       </w:pPr>
       <w:r>
         <w:rPr>
-          <w:rFonts w:ascii="Calibri" w:hAnsi="Calibri" w:eastAsia="ＭＳ ゴシック" w:cs="Calibri" w:asciiTheme="majorHAnsi" w:hAnsiTheme="majorHAnsi" w:eastAsiaTheme="majorEastAsia" w:csTheme="majorBidi"/>
+          <w:rFonts w:ascii="Calibri" w:hAnsi="Calibri" w:eastAsia="ＭＳ ゴシック" w:cs="Calibri" w:asciiTheme="majorHAnsi" w:hAnsiTheme="majorHAnsi" w:eastAsiaTheme="majorEastAsia"/>
           <w:b/>
           <w:bCs/>
-          <w:color w:val="365F91" w:themeColor="accent1" w:themeShade="BF"/>
+          <w:color w:val="1F3864"/>
           <w:sz w:val="28"/>
           <w:szCs w:val="28"/>
         </w:rPr>
@@ -236,7 +1612,7 @@
     </w:p>
     <w:p>
       <w:pPr>
-        <w:spacing w:after="200" w:line="276" w:lineRule="auto"/>
+        <w:spacing w:after="120" w:line="324" w:lineRule="auto"/>
       </w:pPr>
       <w:r>
         <w:rPr>
@@ -244,7 +1620,20 @@
           <w:sz w:val="22"/>
           <w:szCs w:val="22"/>
         </w:rPr>
-        <w:t>데이터 과학 도구(SQLite, Python 머신러닝)를 활용하여 인구수 변동을 예측해 본 결과, 2030년에는 현재보다 인구가 현저히 줄어들 것이라는 객관적 수치를 얻을 수 있었습니다. 이러한 데이터 기반의 분석은 사회적 현상을 직관에 의존하지 않고 객관적, 과학적으로 이해하는 데 큰 도움이 됩니다. 인구 감소 및 고령화는 단시간에 해결할 수 없는 복합적인 문제이므로, 본 분석 결과를 바탕으로 개인, 기업, 국가가 모두 협력하여 더욱 장기적이고 실효성 있는 대책을 시급히 마련해야 함을 깨달을 수 있었습니다.</w:t>
+        <w:t>통계청의 공공데이터와 파이썬 기반 머신러닝 모델을 활용하여 인구 변화를 분석한 결과, 2030년 대한민국 총인구가 5천만 명 선 아래로 내려앉을 것이라는 구체적인 수치를 확인했습니다. 막연한 우려에 머물던 인구 절벽 현상을 정량적 데이터와 통계적 기법으로 실증해보면서, 사회적 현상을 객관적이고 과학적인 시각으로 조망하는 데이터 기반 탐구의 중요성을 깊이 체감할 수 있었습니다.</w:t>
+      </w:r>
+    </w:p>
+    <w:p>
+      <w:pPr>
+        <w:spacing w:after="120" w:line="324" w:lineRule="auto"/>
+      </w:pPr>
+      <w:r>
+        <w:rPr>
+          <w:rFonts w:ascii="Cambria" w:hAnsi="Cambria" w:eastAsia="ＭＳ 明朝" w:cs="Cambria" w:asciiTheme="minorHAnsi" w:hAnsiTheme="minorHAnsi" w:eastAsiaTheme="minorEastAsia" w:csTheme="minorBidi"/>
+          <w:sz w:val="22"/>
+          <w:szCs w:val="22"/>
+        </w:rPr>
+        <w:t>다만 이번 탐구에 적용한 2차 다항 회귀 모델은 과거 15년간의 인구 변동 궤적을 토대로 미래를 외삽한 것이므로, 급격한 출산율 정책의 변화나 이민 유입, 경제 충격과 같은 복합적인 사회적 변인을 모두 반영하지 못했다는 한계를 지닙니다. 그럼에도 이번 분석이 도출한 2030년의 인구 곡선은 우리 사회에 명확한 경고를 던집니다. 인구 위기는 정해진 종말론적 미래가 아니라, 지금 우리가 청년 세대의 고통에 공감하고 과감한 제도 개혁을 단행할 때 충분히 완화할 수 있는 당면 과제임을 이번 수행평가를 통해 깨달았습니다.</w:t>
       </w:r>
     </w:p>
     <w:sectPr>

</xml_diff>